<commit_message>
update as 19th July 2025
</commit_message>
<xml_diff>
--- a/ezHealthKonnect structure.docx
+++ b/ezHealthKonnect structure.docx
@@ -3,9 +3,11 @@
 <w:document xmlns:wpc="http://schemas.microsoft.com/office/word/2010/wordprocessingCanvas" xmlns:cx="http://schemas.microsoft.com/office/drawing/2014/chartex" xmlns:cx1="http://schemas.microsoft.com/office/drawing/2015/9/8/chartex" xmlns:cx2="http://schemas.microsoft.com/office/drawing/2015/10/21/chartex" xmlns:cx3="http://schemas.microsoft.com/office/drawing/2016/5/9/chartex" xmlns:cx4="http://schemas.microsoft.com/office/drawing/2016/5/10/chartex" xmlns:cx5="http://schemas.microsoft.com/office/drawing/2016/5/11/chartex" xmlns:cx6="http://schemas.microsoft.com/office/drawing/2016/5/12/chartex" xmlns:cx7="http://schemas.microsoft.com/office/drawing/2016/5/13/chartex" xmlns:cx8="http://schemas.microsoft.com/office/drawing/2016/5/14/chartex" xmlns:mc="http://schemas.openxmlformats.org/markup-compatibility/2006" xmlns:aink="http://schemas.microsoft.com/office/drawing/2016/ink" xmlns:am3d="http://schemas.microsoft.com/office/drawing/2017/model3d" xmlns:o="urn:schemas-microsoft-com:office:office" xmlns:oel="http://schemas.microsoft.com/office/2019/extlst" xmlns:r="http://schemas.openxmlformats.org/officeDocument/2006/relationships" xmlns:m="http://schemas.openxmlformats.org/officeDocument/2006/math" xmlns:v="urn:schemas-microsoft-com:vml" xmlns:wp14="http://schemas.microsoft.com/office/word/2010/wordprocessingDrawing" xmlns:wp="http://schemas.openxmlformats.org/drawingml/2006/wordprocessingDrawing" xmlns:w10="urn:schemas-microsoft-com:office:word" xmlns:w="http://schemas.openxmlformats.org/wordprocessingml/2006/main" xmlns:w14="http://schemas.microsoft.com/office/word/2010/wordml" xmlns:w15="http://schemas.microsoft.com/office/word/2012/wordml" xmlns:w16cex="http://schemas.microsoft.com/office/word/2018/wordml/cex" xmlns:w16cid="http://schemas.microsoft.com/office/word/2016/wordml/cid" xmlns:w16="http://schemas.microsoft.com/office/word/2018/wordml" xmlns:w16du="http://schemas.microsoft.com/office/word/2023/wordml/word16du" xmlns:w16sdtdh="http://schemas.microsoft.com/office/word/2020/wordml/sdtdatahash" xmlns:w16sdtfl="http://schemas.microsoft.com/office/word/2024/wordml/sdtformatlock" xmlns:w16se="http://schemas.microsoft.com/office/word/2015/wordml/symex" xmlns:wpg="http://schemas.microsoft.com/office/word/2010/wordprocessingGroup" xmlns:wpi="http://schemas.microsoft.com/office/word/2010/wordprocessingInk" xmlns:wne="http://schemas.microsoft.com/office/word/2006/wordml" xmlns:wps="http://schemas.microsoft.com/office/word/2010/wordprocessingShape" mc:Ignorable="w14 w15 w16se w16cid w16 w16cex w16sdtdh w16sdtfl w16du wp14">
   <w:body>
     <w:p>
+      <w:proofErr w:type="spellStart"/>
       <w:r>
         <w:t>ezHealthKonnect</w:t>
       </w:r>
+      <w:proofErr w:type="spellEnd"/>
     </w:p>
     <w:p>
       <w:pPr>
@@ -27,9 +29,13 @@
           <w:numId w:val="1"/>
         </w:numPr>
       </w:pPr>
+      <w:proofErr w:type="spellStart"/>
+      <w:proofErr w:type="gramStart"/>
       <w:r>
         <w:t>config.go</w:t>
       </w:r>
+      <w:proofErr w:type="spellEnd"/>
+      <w:proofErr w:type="gramEnd"/>
     </w:p>
     <w:p>
       <w:pPr>
@@ -88,20 +94,51 @@
         </w:numPr>
       </w:pPr>
       <w:r>
-        <w:t>hl7_controller.go</w:t>
-      </w:r>
-    </w:p>
-    <w:p>
-      <w:pPr>
-        <w:pStyle w:val="ListParagraph"/>
-        <w:numPr>
-          <w:ilvl w:val="1"/>
-          <w:numId w:val="1"/>
-        </w:numPr>
-      </w:pPr>
-      <w:r>
-        <w:t>interface_controller.go</w:t>
-      </w:r>
+        <w:t>hl7_</w:t>
+      </w:r>
+      <w:proofErr w:type="gramStart"/>
+      <w:r>
+        <w:t>controller.go</w:t>
+      </w:r>
+      <w:proofErr w:type="gramEnd"/>
+    </w:p>
+    <w:p>
+      <w:pPr>
+        <w:pStyle w:val="ListParagraph"/>
+        <w:numPr>
+          <w:ilvl w:val="1"/>
+          <w:numId w:val="1"/>
+        </w:numPr>
+      </w:pPr>
+      <w:proofErr w:type="spellStart"/>
+      <w:r>
+        <w:t>fhir_transform_</w:t>
+      </w:r>
+      <w:proofErr w:type="gramStart"/>
+      <w:r>
+        <w:t>controller.go</w:t>
+      </w:r>
+      <w:proofErr w:type="spellEnd"/>
+      <w:proofErr w:type="gramEnd"/>
+    </w:p>
+    <w:p>
+      <w:pPr>
+        <w:pStyle w:val="ListParagraph"/>
+        <w:numPr>
+          <w:ilvl w:val="1"/>
+          <w:numId w:val="1"/>
+        </w:numPr>
+      </w:pPr>
+      <w:proofErr w:type="spellStart"/>
+      <w:r>
+        <w:t>interface_</w:t>
+      </w:r>
+      <w:proofErr w:type="gramStart"/>
+      <w:r>
+        <w:t>controller.go</w:t>
+      </w:r>
+      <w:proofErr w:type="spellEnd"/>
+      <w:proofErr w:type="gramEnd"/>
     </w:p>
     <w:p>
       <w:pPr>
@@ -123,9 +160,16 @@
           <w:numId w:val="1"/>
         </w:numPr>
       </w:pPr>
-      <w:r>
-        <w:t>system_controller.go</w:t>
-      </w:r>
+      <w:proofErr w:type="spellStart"/>
+      <w:r>
+        <w:t>system_</w:t>
+      </w:r>
+      <w:proofErr w:type="gramStart"/>
+      <w:r>
+        <w:t>controller.go</w:t>
+      </w:r>
+      <w:proofErr w:type="spellEnd"/>
+      <w:proofErr w:type="gramEnd"/>
     </w:p>
     <w:p>
       <w:pPr>
@@ -143,10 +187,122 @@
       <w:pPr>
         <w:pStyle w:val="ListParagraph"/>
         <w:numPr>
+          <w:ilvl w:val="1"/>
+          <w:numId w:val="1"/>
+        </w:numPr>
+      </w:pPr>
+      <w:proofErr w:type="spellStart"/>
+      <w:r>
+        <w:t>schema_fhir_transform_</w:t>
+      </w:r>
+      <w:proofErr w:type="gramStart"/>
+      <w:r>
+        <w:t>controller.go</w:t>
+      </w:r>
+      <w:proofErr w:type="spellEnd"/>
+      <w:proofErr w:type="gramEnd"/>
+    </w:p>
+    <w:p>
+      <w:pPr>
+        <w:pStyle w:val="ListParagraph"/>
+        <w:numPr>
           <w:ilvl w:val="0"/>
           <w:numId w:val="1"/>
         </w:numPr>
       </w:pPr>
+      <w:proofErr w:type="spellStart"/>
+      <w:r>
+        <w:t>fhir</w:t>
+      </w:r>
+      <w:proofErr w:type="spellEnd"/>
+      <w:r>
+        <w:t>/</w:t>
+      </w:r>
+    </w:p>
+    <w:p>
+      <w:pPr>
+        <w:pStyle w:val="ListParagraph"/>
+        <w:numPr>
+          <w:ilvl w:val="1"/>
+          <w:numId w:val="1"/>
+        </w:numPr>
+      </w:pPr>
+      <w:proofErr w:type="spellStart"/>
+      <w:r>
+        <w:t>schema_</w:t>
+      </w:r>
+      <w:proofErr w:type="gramStart"/>
+      <w:r>
+        <w:t>loader.go</w:t>
+      </w:r>
+      <w:proofErr w:type="spellEnd"/>
+      <w:proofErr w:type="gramEnd"/>
+    </w:p>
+    <w:p>
+      <w:pPr>
+        <w:pStyle w:val="ListParagraph"/>
+        <w:numPr>
+          <w:ilvl w:val="1"/>
+          <w:numId w:val="1"/>
+        </w:numPr>
+      </w:pPr>
+      <w:proofErr w:type="spellStart"/>
+      <w:r>
+        <w:t>transformation_</w:t>
+      </w:r>
+      <w:proofErr w:type="gramStart"/>
+      <w:r>
+        <w:t>engine.go</w:t>
+      </w:r>
+      <w:proofErr w:type="spellEnd"/>
+      <w:proofErr w:type="gramEnd"/>
+    </w:p>
+    <w:p>
+      <w:pPr>
+        <w:pStyle w:val="ListParagraph"/>
+        <w:numPr>
+          <w:ilvl w:val="1"/>
+          <w:numId w:val="1"/>
+        </w:numPr>
+      </w:pPr>
+      <w:proofErr w:type="spellStart"/>
+      <w:r>
+        <w:t>validation_</w:t>
+      </w:r>
+      <w:proofErr w:type="gramStart"/>
+      <w:r>
+        <w:t>bundle.go</w:t>
+      </w:r>
+      <w:proofErr w:type="spellEnd"/>
+      <w:proofErr w:type="gramEnd"/>
+    </w:p>
+    <w:p>
+      <w:pPr>
+        <w:pStyle w:val="ListParagraph"/>
+        <w:numPr>
+          <w:ilvl w:val="1"/>
+          <w:numId w:val="1"/>
+        </w:numPr>
+      </w:pPr>
+      <w:proofErr w:type="spellStart"/>
+      <w:r>
+        <w:t>value_</w:t>
+      </w:r>
+      <w:proofErr w:type="gramStart"/>
+      <w:r>
+        <w:t>transformers.go</w:t>
+      </w:r>
+      <w:proofErr w:type="spellEnd"/>
+      <w:proofErr w:type="gramEnd"/>
+    </w:p>
+    <w:p>
+      <w:pPr>
+        <w:pStyle w:val="ListParagraph"/>
+        <w:numPr>
+          <w:ilvl w:val="0"/>
+          <w:numId w:val="1"/>
+        </w:numPr>
+      </w:pPr>
       <w:r>
         <w:t>hl7/</w:t>
       </w:r>
@@ -159,45 +315,67 @@
           <w:numId w:val="1"/>
         </w:numPr>
       </w:pPr>
+      <w:proofErr w:type="spellStart"/>
+      <w:proofErr w:type="gramStart"/>
       <w:r>
         <w:t>parser.go</w:t>
       </w:r>
-    </w:p>
-    <w:p>
-      <w:pPr>
-        <w:pStyle w:val="ListParagraph"/>
-        <w:numPr>
-          <w:ilvl w:val="1"/>
-          <w:numId w:val="1"/>
-        </w:numPr>
-      </w:pPr>
+      <w:proofErr w:type="spellEnd"/>
+      <w:proofErr w:type="gramEnd"/>
+    </w:p>
+    <w:p>
+      <w:pPr>
+        <w:pStyle w:val="ListParagraph"/>
+        <w:numPr>
+          <w:ilvl w:val="1"/>
+          <w:numId w:val="1"/>
+        </w:numPr>
+      </w:pPr>
+      <w:proofErr w:type="spellStart"/>
+      <w:proofErr w:type="gramStart"/>
       <w:r>
         <w:t>types.go</w:t>
       </w:r>
-    </w:p>
-    <w:p>
-      <w:pPr>
-        <w:pStyle w:val="ListParagraph"/>
-        <w:numPr>
-          <w:ilvl w:val="1"/>
-          <w:numId w:val="1"/>
-        </w:numPr>
-      </w:pPr>
-      <w:r>
-        <w:t>real_schema_parser.go</w:t>
-      </w:r>
-    </w:p>
-    <w:p>
-      <w:pPr>
-        <w:pStyle w:val="ListParagraph"/>
-        <w:numPr>
-          <w:ilvl w:val="1"/>
-          <w:numId w:val="1"/>
-        </w:numPr>
-      </w:pPr>
-      <w:r>
-        <w:t>unified_parser.go</w:t>
-      </w:r>
+      <w:proofErr w:type="spellEnd"/>
+      <w:proofErr w:type="gramEnd"/>
+    </w:p>
+    <w:p>
+      <w:pPr>
+        <w:pStyle w:val="ListParagraph"/>
+        <w:numPr>
+          <w:ilvl w:val="1"/>
+          <w:numId w:val="1"/>
+        </w:numPr>
+      </w:pPr>
+      <w:proofErr w:type="spellStart"/>
+      <w:r>
+        <w:t>real_schema_</w:t>
+      </w:r>
+      <w:proofErr w:type="gramStart"/>
+      <w:r>
+        <w:t>parser.go</w:t>
+      </w:r>
+      <w:proofErr w:type="spellEnd"/>
+      <w:proofErr w:type="gramEnd"/>
+    </w:p>
+    <w:p>
+      <w:pPr>
+        <w:pStyle w:val="ListParagraph"/>
+        <w:numPr>
+          <w:ilvl w:val="1"/>
+          <w:numId w:val="1"/>
+        </w:numPr>
+      </w:pPr>
+      <w:proofErr w:type="spellStart"/>
+      <w:r>
+        <w:t>unified_</w:t>
+      </w:r>
+      <w:proofErr w:type="gramStart"/>
+      <w:r>
+        <w:t>parser.go</w:t>
+      </w:r>
+      <w:proofErr w:type="spellEnd"/>
+      <w:proofErr w:type="gramEnd"/>
     </w:p>
     <w:p>
       <w:pPr>
@@ -297,8 +475,13 @@
           <w:numId w:val="1"/>
         </w:numPr>
       </w:pPr>
-      <w:r>
-        <w:t>css/</w:t>
+      <w:proofErr w:type="spellStart"/>
+      <w:r>
+        <w:t>css</w:t>
+      </w:r>
+      <w:proofErr w:type="spellEnd"/>
+      <w:r>
+        <w:t>/</w:t>
       </w:r>
     </w:p>
     <w:p>
@@ -381,8 +564,13 @@
           <w:numId w:val="1"/>
         </w:numPr>
       </w:pPr>
-      <w:r>
-        <w:t>js/</w:t>
+      <w:proofErr w:type="spellStart"/>
+      <w:r>
+        <w:t>js</w:t>
+      </w:r>
+      <w:proofErr w:type="spellEnd"/>
+      <w:r>
+        <w:t>/</w:t>
       </w:r>
     </w:p>
     <w:p>
@@ -478,6 +666,7 @@
         </w:numPr>
       </w:pPr>
       <w:r>
+        <w:lastRenderedPageBreak/>
         <w:t>healthcare-rules.js</w:t>
       </w:r>
     </w:p>
@@ -562,45 +751,494 @@
         </w:numPr>
       </w:pPr>
       <w:r>
+        <w:t>segment-viewer.js</w:t>
+      </w:r>
+    </w:p>
+    <w:p>
+      <w:pPr>
+        <w:pStyle w:val="ListParagraph"/>
+        <w:numPr>
+          <w:ilvl w:val="3"/>
+          <w:numId w:val="1"/>
+        </w:numPr>
+      </w:pPr>
+      <w:r>
+        <w:t>step-handlers.js</w:t>
+      </w:r>
+    </w:p>
+    <w:p>
+      <w:pPr>
+        <w:pStyle w:val="ListParagraph"/>
+        <w:numPr>
+          <w:ilvl w:val="3"/>
+          <w:numId w:val="1"/>
+        </w:numPr>
+      </w:pPr>
+      <w:r>
+        <w:t>wizard-main.js</w:t>
+      </w:r>
+    </w:p>
+    <w:p>
+      <w:pPr>
+        <w:pStyle w:val="ListParagraph"/>
+        <w:numPr>
+          <w:ilvl w:val="3"/>
+          <w:numId w:val="1"/>
+        </w:numPr>
+      </w:pPr>
+      <w:r>
+        <w:t>wizard-services.js</w:t>
+      </w:r>
+    </w:p>
+    <w:p>
+      <w:pPr>
+        <w:pStyle w:val="ListParagraph"/>
+        <w:numPr>
+          <w:ilvl w:val="0"/>
+          <w:numId w:val="1"/>
+        </w:numPr>
+      </w:pPr>
+      <w:r>
+        <w:t>routes/</w:t>
+      </w:r>
+    </w:p>
+    <w:p>
+      <w:pPr>
+        <w:pStyle w:val="ListParagraph"/>
+        <w:numPr>
+          <w:ilvl w:val="1"/>
+          <w:numId w:val="1"/>
+        </w:numPr>
+      </w:pPr>
+      <w:r>
+        <w:t>auth.js</w:t>
+      </w:r>
+    </w:p>
+    <w:p>
+      <w:pPr>
+        <w:pStyle w:val="ListParagraph"/>
+        <w:numPr>
+          <w:ilvl w:val="1"/>
+          <w:numId w:val="1"/>
+        </w:numPr>
+      </w:pPr>
+      <w:r>
+        <w:t>index.js</w:t>
+      </w:r>
+    </w:p>
+    <w:p>
+      <w:pPr>
+        <w:pStyle w:val="ListParagraph"/>
+        <w:numPr>
+          <w:ilvl w:val="1"/>
+          <w:numId w:val="1"/>
+        </w:numPr>
+      </w:pPr>
+      <w:r>
+        <w:t>interfacesRoutes.js</w:t>
+      </w:r>
+    </w:p>
+    <w:p>
+      <w:pPr>
+        <w:pStyle w:val="ListParagraph"/>
+        <w:numPr>
+          <w:ilvl w:val="1"/>
+          <w:numId w:val="1"/>
+        </w:numPr>
+      </w:pPr>
+      <w:r>
+        <w:t>users.js</w:t>
+      </w:r>
+    </w:p>
+    <w:p>
+      <w:pPr>
+        <w:pStyle w:val="ListParagraph"/>
+        <w:numPr>
+          <w:ilvl w:val="0"/>
+          <w:numId w:val="1"/>
+        </w:numPr>
+      </w:pPr>
+      <w:r>
+        <w:t>schemas/</w:t>
+      </w:r>
+    </w:p>
+    <w:p>
+      <w:pPr>
+        <w:pStyle w:val="ListParagraph"/>
+        <w:numPr>
+          <w:ilvl w:val="1"/>
+          <w:numId w:val="1"/>
+        </w:numPr>
+      </w:pPr>
+      <w:proofErr w:type="spellStart"/>
+      <w:r>
+        <w:t>fhir</w:t>
+      </w:r>
+      <w:proofErr w:type="spellEnd"/>
+      <w:r>
+        <w:t>/</w:t>
+      </w:r>
+    </w:p>
+    <w:p>
+      <w:pPr>
+        <w:pStyle w:val="ListParagraph"/>
+        <w:numPr>
+          <w:ilvl w:val="2"/>
+          <w:numId w:val="1"/>
+        </w:numPr>
+      </w:pPr>
+      <w:r>
+        <w:t>R4</w:t>
+      </w:r>
+    </w:p>
+    <w:p>
+      <w:pPr>
+        <w:pStyle w:val="ListParagraph"/>
+        <w:numPr>
+          <w:ilvl w:val="3"/>
+          <w:numId w:val="1"/>
+        </w:numPr>
+      </w:pPr>
+      <w:r>
+        <w:t>Datatypes/</w:t>
+      </w:r>
+    </w:p>
+    <w:p>
+      <w:pPr>
+        <w:pStyle w:val="ListParagraph"/>
+        <w:numPr>
+          <w:ilvl w:val="3"/>
+          <w:numId w:val="1"/>
+        </w:numPr>
+      </w:pPr>
+      <w:r>
+        <w:t>profiles/</w:t>
+      </w:r>
+    </w:p>
+    <w:p>
+      <w:pPr>
+        <w:pStyle w:val="ListParagraph"/>
+        <w:numPr>
+          <w:ilvl w:val="4"/>
+          <w:numId w:val="1"/>
+        </w:numPr>
+      </w:pPr>
+      <w:r>
+        <w:t>us-core/</w:t>
+      </w:r>
+    </w:p>
+    <w:p>
+      <w:pPr>
+        <w:pStyle w:val="ListParagraph"/>
+        <w:numPr>
+          <w:ilvl w:val="5"/>
+          <w:numId w:val="1"/>
+        </w:numPr>
+      </w:pPr>
+      <w:r>
+        <w:t>Encounter.gz</w:t>
+      </w:r>
+    </w:p>
+    <w:p>
+      <w:pPr>
+        <w:pStyle w:val="ListParagraph"/>
+        <w:numPr>
+          <w:ilvl w:val="5"/>
+          <w:numId w:val="1"/>
+        </w:numPr>
+      </w:pPr>
+      <w:r>
+        <w:t>Patient.gz</w:t>
+      </w:r>
+    </w:p>
+    <w:p>
+      <w:pPr>
+        <w:pStyle w:val="ListParagraph"/>
+        <w:numPr>
+          <w:ilvl w:val="3"/>
+          <w:numId w:val="1"/>
+        </w:numPr>
+      </w:pPr>
+      <w:r>
+        <w:t>Resources/</w:t>
+      </w:r>
+    </w:p>
+    <w:p>
+      <w:pPr>
+        <w:pStyle w:val="ListParagraph"/>
+        <w:numPr>
+          <w:ilvl w:val="4"/>
+          <w:numId w:val="1"/>
+        </w:numPr>
+      </w:pPr>
+      <w:r>
+        <w:t>Encounter.gz</w:t>
+      </w:r>
+    </w:p>
+    <w:p>
+      <w:pPr>
+        <w:pStyle w:val="ListParagraph"/>
+        <w:numPr>
+          <w:ilvl w:val="4"/>
+          <w:numId w:val="1"/>
+        </w:numPr>
+      </w:pPr>
+      <w:r>
+        <w:t>Patient.gz</w:t>
+      </w:r>
+    </w:p>
+    <w:p>
+      <w:pPr>
+        <w:pStyle w:val="ListParagraph"/>
+        <w:numPr>
+          <w:ilvl w:val="1"/>
+          <w:numId w:val="1"/>
+        </w:numPr>
+      </w:pPr>
+      <w:r>
+        <w:t>hl7/</w:t>
+      </w:r>
+    </w:p>
+    <w:p>
+      <w:pPr>
+        <w:pStyle w:val="ListParagraph"/>
+        <w:numPr>
+          <w:ilvl w:val="2"/>
+          <w:numId w:val="1"/>
+        </w:numPr>
+      </w:pPr>
+      <w:r>
+        <w:t>v2.1/</w:t>
+      </w:r>
+    </w:p>
+    <w:p>
+      <w:pPr>
+        <w:pStyle w:val="ListParagraph"/>
+        <w:numPr>
+          <w:ilvl w:val="3"/>
+          <w:numId w:val="1"/>
+        </w:numPr>
+      </w:pPr>
+      <w:r>
+        <w:t>ADT_A04.gz</w:t>
+      </w:r>
+    </w:p>
+    <w:p>
+      <w:pPr>
+        <w:pStyle w:val="ListParagraph"/>
+        <w:numPr>
+          <w:ilvl w:val="3"/>
+          <w:numId w:val="1"/>
+        </w:numPr>
+      </w:pPr>
+      <w:r>
+        <w:t>ADT_A01.gz</w:t>
+      </w:r>
+    </w:p>
+    <w:p>
+      <w:pPr>
+        <w:pStyle w:val="ListParagraph"/>
+        <w:numPr>
+          <w:ilvl w:val="2"/>
+          <w:numId w:val="1"/>
+        </w:numPr>
+      </w:pPr>
+      <w:r>
+        <w:t>V2.3/</w:t>
+      </w:r>
+    </w:p>
+    <w:p>
+      <w:pPr>
+        <w:pStyle w:val="ListParagraph"/>
+        <w:numPr>
+          <w:ilvl w:val="3"/>
+          <w:numId w:val="1"/>
+        </w:numPr>
+      </w:pPr>
+      <w:r>
+        <w:t>ADT_A04.gz</w:t>
+      </w:r>
+    </w:p>
+    <w:p>
+      <w:pPr>
+        <w:pStyle w:val="ListParagraph"/>
+        <w:numPr>
+          <w:ilvl w:val="3"/>
+          <w:numId w:val="1"/>
+        </w:numPr>
+      </w:pPr>
+      <w:r>
+        <w:t>ADT_A01.gz</w:t>
+      </w:r>
+    </w:p>
+    <w:p>
+      <w:pPr>
+        <w:pStyle w:val="ListParagraph"/>
+        <w:numPr>
+          <w:ilvl w:val="2"/>
+          <w:numId w:val="1"/>
+        </w:numPr>
+      </w:pPr>
+      <w:r>
+        <w:t>V2.5.1/</w:t>
+      </w:r>
+    </w:p>
+    <w:p>
+      <w:pPr>
+        <w:pStyle w:val="ListParagraph"/>
+        <w:numPr>
+          <w:ilvl w:val="3"/>
+          <w:numId w:val="1"/>
+        </w:numPr>
+      </w:pPr>
+      <w:r>
+        <w:t>ADT_A04.gz</w:t>
+      </w:r>
+    </w:p>
+    <w:p>
+      <w:pPr>
+        <w:pStyle w:val="ListParagraph"/>
+        <w:numPr>
+          <w:ilvl w:val="3"/>
+          <w:numId w:val="1"/>
+        </w:numPr>
+      </w:pPr>
+      <w:r>
+        <w:t>ADT_A01.gz</w:t>
+      </w:r>
+    </w:p>
+    <w:p>
+      <w:pPr>
+        <w:pStyle w:val="ListParagraph"/>
+        <w:ind w:left="2160"/>
+      </w:pPr>
+    </w:p>
+    <w:p>
+      <w:pPr>
+        <w:pStyle w:val="ListParagraph"/>
+        <w:numPr>
+          <w:ilvl w:val="0"/>
+          <w:numId w:val="1"/>
+        </w:numPr>
+      </w:pPr>
+      <w:r>
+        <w:t>services/</w:t>
+      </w:r>
+    </w:p>
+    <w:p>
+      <w:pPr>
+        <w:pStyle w:val="ListParagraph"/>
+        <w:numPr>
+          <w:ilvl w:val="1"/>
+          <w:numId w:val="1"/>
+        </w:numPr>
+      </w:pPr>
+      <w:r>
+        <w:t>auditService.js</w:t>
+      </w:r>
+    </w:p>
+    <w:p>
+      <w:pPr>
+        <w:pStyle w:val="ListParagraph"/>
+        <w:numPr>
+          <w:ilvl w:val="1"/>
+          <w:numId w:val="1"/>
+        </w:numPr>
+      </w:pPr>
+      <w:r>
+        <w:t>userService.js</w:t>
+      </w:r>
+    </w:p>
+    <w:p>
+      <w:pPr>
+        <w:pStyle w:val="ListParagraph"/>
+        <w:numPr>
+          <w:ilvl w:val="0"/>
+          <w:numId w:val="1"/>
+        </w:numPr>
+      </w:pPr>
+      <w:r>
+        <w:t>scripts/</w:t>
+      </w:r>
+    </w:p>
+    <w:p>
+      <w:pPr>
+        <w:pStyle w:val="ListParagraph"/>
+        <w:numPr>
+          <w:ilvl w:val="1"/>
+          <w:numId w:val="1"/>
+        </w:numPr>
+      </w:pPr>
+      <w:proofErr w:type="spellStart"/>
+      <w:r>
+        <w:t>config.env</w:t>
+      </w:r>
+      <w:proofErr w:type="spellEnd"/>
+    </w:p>
+    <w:p>
+      <w:pPr>
+        <w:pStyle w:val="ListParagraph"/>
+        <w:numPr>
+          <w:ilvl w:val="1"/>
+          <w:numId w:val="1"/>
+        </w:numPr>
+      </w:pPr>
+      <w:r>
+        <w:t>migrate-interfaces.js</w:t>
+      </w:r>
+    </w:p>
+    <w:p>
+      <w:pPr>
+        <w:pStyle w:val="ListParagraph"/>
+        <w:numPr>
+          <w:ilvl w:val="0"/>
+          <w:numId w:val="1"/>
+        </w:numPr>
+      </w:pPr>
+      <w:proofErr w:type="gramStart"/>
+      <w:r>
+        <w:t>.env</w:t>
+      </w:r>
+      <w:proofErr w:type="gramEnd"/>
+    </w:p>
+    <w:p>
+      <w:pPr>
+        <w:pStyle w:val="ListParagraph"/>
+        <w:numPr>
+          <w:ilvl w:val="0"/>
+          <w:numId w:val="1"/>
+        </w:numPr>
+      </w:pPr>
+      <w:r>
+        <w:t>app.js</w:t>
+      </w:r>
+    </w:p>
+    <w:p>
+      <w:pPr>
+        <w:pStyle w:val="ListParagraph"/>
+        <w:numPr>
+          <w:ilvl w:val="0"/>
+          <w:numId w:val="1"/>
+        </w:numPr>
+      </w:pPr>
+      <w:r>
+        <w:t>go.mod</w:t>
+      </w:r>
+    </w:p>
+    <w:p>
+      <w:pPr>
+        <w:pStyle w:val="ListParagraph"/>
+        <w:numPr>
+          <w:ilvl w:val="0"/>
+          <w:numId w:val="1"/>
+        </w:numPr>
+      </w:pPr>
+      <w:proofErr w:type="spellStart"/>
+      <w:r>
         <w:lastRenderedPageBreak/>
-        <w:t>segment-viewer.js</w:t>
-      </w:r>
-    </w:p>
-    <w:p>
-      <w:pPr>
-        <w:pStyle w:val="ListParagraph"/>
-        <w:numPr>
-          <w:ilvl w:val="3"/>
-          <w:numId w:val="1"/>
-        </w:numPr>
-      </w:pPr>
-      <w:r>
-        <w:t>step-handlers.js</w:t>
-      </w:r>
-    </w:p>
-    <w:p>
-      <w:pPr>
-        <w:pStyle w:val="ListParagraph"/>
-        <w:numPr>
-          <w:ilvl w:val="3"/>
-          <w:numId w:val="1"/>
-        </w:numPr>
-      </w:pPr>
-      <w:r>
-        <w:t>wizard-main.js</w:t>
-      </w:r>
-    </w:p>
-    <w:p>
-      <w:pPr>
-        <w:pStyle w:val="ListParagraph"/>
-        <w:numPr>
-          <w:ilvl w:val="3"/>
-          <w:numId w:val="1"/>
-        </w:numPr>
-      </w:pPr>
-      <w:r>
-        <w:t>wizard-services.js</w:t>
-      </w:r>
+        <w:t>go.sum</w:t>
+      </w:r>
+      <w:proofErr w:type="spellEnd"/>
     </w:p>
     <w:p>
       <w:pPr>
@@ -610,81 +1248,13 @@
           <w:numId w:val="1"/>
         </w:numPr>
       </w:pPr>
-      <w:r>
-        <w:t>routes/</w:t>
-      </w:r>
-    </w:p>
-    <w:p>
-      <w:pPr>
-        <w:pStyle w:val="ListParagraph"/>
-        <w:numPr>
-          <w:ilvl w:val="1"/>
-          <w:numId w:val="1"/>
-        </w:numPr>
-      </w:pPr>
-      <w:r>
-        <w:t>auth.js</w:t>
-      </w:r>
-    </w:p>
-    <w:p>
-      <w:pPr>
-        <w:pStyle w:val="ListParagraph"/>
-        <w:numPr>
-          <w:ilvl w:val="1"/>
-          <w:numId w:val="1"/>
-        </w:numPr>
-      </w:pPr>
-      <w:r>
-        <w:t>hl7_dictionary.js</w:t>
-      </w:r>
-    </w:p>
-    <w:p>
-      <w:pPr>
-        <w:pStyle w:val="ListParagraph"/>
-        <w:numPr>
-          <w:ilvl w:val="1"/>
-          <w:numId w:val="1"/>
-        </w:numPr>
-      </w:pPr>
-      <w:r>
-        <w:t>hl7Routes.js</w:t>
-      </w:r>
-    </w:p>
-    <w:p>
-      <w:pPr>
-        <w:pStyle w:val="ListParagraph"/>
-        <w:numPr>
-          <w:ilvl w:val="1"/>
-          <w:numId w:val="1"/>
-        </w:numPr>
-      </w:pPr>
-      <w:r>
-        <w:t>index.js</w:t>
-      </w:r>
-    </w:p>
-    <w:p>
-      <w:pPr>
-        <w:pStyle w:val="ListParagraph"/>
-        <w:numPr>
-          <w:ilvl w:val="1"/>
-          <w:numId w:val="1"/>
-        </w:numPr>
-      </w:pPr>
-      <w:r>
-        <w:t>interfacesRoutes.js</w:t>
-      </w:r>
-    </w:p>
-    <w:p>
-      <w:pPr>
-        <w:pStyle w:val="ListParagraph"/>
-        <w:numPr>
-          <w:ilvl w:val="1"/>
-          <w:numId w:val="1"/>
-        </w:numPr>
-      </w:pPr>
-      <w:r>
-        <w:t>users.js</w:t>
-      </w:r>
+      <w:proofErr w:type="spellStart"/>
+      <w:proofErr w:type="gramStart"/>
+      <w:r>
+        <w:t>main.go</w:t>
+      </w:r>
+      <w:proofErr w:type="spellEnd"/>
+      <w:proofErr w:type="gramEnd"/>
     </w:p>
     <w:p>
       <w:pPr>
@@ -694,135 +1264,13 @@
           <w:numId w:val="1"/>
         </w:numPr>
       </w:pPr>
-      <w:r>
-        <w:t>schemas/</w:t>
-      </w:r>
-    </w:p>
-    <w:p>
-      <w:pPr>
-        <w:pStyle w:val="ListParagraph"/>
-        <w:numPr>
-          <w:ilvl w:val="1"/>
-          <w:numId w:val="1"/>
-        </w:numPr>
-      </w:pPr>
-      <w:r>
-        <w:t>hl7/</w:t>
-      </w:r>
-    </w:p>
-    <w:p>
-      <w:pPr>
-        <w:pStyle w:val="ListParagraph"/>
-        <w:numPr>
-          <w:ilvl w:val="2"/>
-          <w:numId w:val="1"/>
-        </w:numPr>
-      </w:pPr>
-      <w:r>
-        <w:t>v2.1/</w:t>
-      </w:r>
-    </w:p>
-    <w:p>
-      <w:pPr>
-        <w:pStyle w:val="ListParagraph"/>
-        <w:numPr>
-          <w:ilvl w:val="3"/>
-          <w:numId w:val="1"/>
-        </w:numPr>
-      </w:pPr>
-      <w:r>
-        <w:t>ADT_A04.gz</w:t>
-      </w:r>
-    </w:p>
-    <w:p>
-      <w:pPr>
-        <w:pStyle w:val="ListParagraph"/>
-        <w:numPr>
-          <w:ilvl w:val="3"/>
-          <w:numId w:val="1"/>
-        </w:numPr>
-      </w:pPr>
-      <w:r>
-        <w:t>ADT_A01.gz</w:t>
-      </w:r>
-    </w:p>
-    <w:p>
-      <w:pPr>
-        <w:pStyle w:val="ListParagraph"/>
-        <w:numPr>
-          <w:ilvl w:val="2"/>
-          <w:numId w:val="1"/>
-        </w:numPr>
-      </w:pPr>
-      <w:r>
-        <w:t>V2.3/</w:t>
-      </w:r>
-    </w:p>
-    <w:p>
-      <w:pPr>
-        <w:pStyle w:val="ListParagraph"/>
-        <w:numPr>
-          <w:ilvl w:val="3"/>
-          <w:numId w:val="1"/>
-        </w:numPr>
-      </w:pPr>
-      <w:r>
-        <w:t>ADT_A04.gz</w:t>
-      </w:r>
-    </w:p>
-    <w:p>
-      <w:pPr>
-        <w:pStyle w:val="ListParagraph"/>
-        <w:numPr>
-          <w:ilvl w:val="3"/>
-          <w:numId w:val="1"/>
-        </w:numPr>
-      </w:pPr>
-      <w:r>
-        <w:t>ADT_A01.gz</w:t>
-      </w:r>
-    </w:p>
-    <w:p>
-      <w:pPr>
-        <w:pStyle w:val="ListParagraph"/>
-        <w:numPr>
-          <w:ilvl w:val="2"/>
-          <w:numId w:val="1"/>
-        </w:numPr>
-      </w:pPr>
-      <w:r>
-        <w:t>V2.5.1/</w:t>
-      </w:r>
-    </w:p>
-    <w:p>
-      <w:pPr>
-        <w:pStyle w:val="ListParagraph"/>
-        <w:numPr>
-          <w:ilvl w:val="3"/>
-          <w:numId w:val="1"/>
-        </w:numPr>
-      </w:pPr>
-      <w:r>
-        <w:t>ADT_A04.gz</w:t>
-      </w:r>
-    </w:p>
-    <w:p>
-      <w:pPr>
-        <w:pStyle w:val="ListParagraph"/>
-        <w:numPr>
-          <w:ilvl w:val="3"/>
-          <w:numId w:val="1"/>
-        </w:numPr>
-      </w:pPr>
-      <w:r>
-        <w:t>ADT_A01.gz</w:t>
-      </w:r>
-    </w:p>
-    <w:p>
-      <w:pPr>
-        <w:pStyle w:val="ListParagraph"/>
-        <w:ind w:left="2160"/>
-      </w:pPr>
+      <w:proofErr w:type="spellStart"/>
+      <w:proofErr w:type="gramStart"/>
+      <w:r>
+        <w:t>package.json</w:t>
+      </w:r>
+      <w:proofErr w:type="spellEnd"/>
+      <w:proofErr w:type="gramEnd"/>
     </w:p>
     <w:p>
       <w:pPr>
@@ -833,67 +1281,7 @@
         </w:numPr>
       </w:pPr>
       <w:r>
-        <w:t>services/</w:t>
-      </w:r>
-    </w:p>
-    <w:p>
-      <w:pPr>
-        <w:pStyle w:val="ListParagraph"/>
-        <w:numPr>
-          <w:ilvl w:val="1"/>
-          <w:numId w:val="1"/>
-        </w:numPr>
-      </w:pPr>
-      <w:r>
-        <w:t>auditService.js</w:t>
-      </w:r>
-    </w:p>
-    <w:p>
-      <w:pPr>
-        <w:pStyle w:val="ListParagraph"/>
-        <w:numPr>
-          <w:ilvl w:val="1"/>
-          <w:numId w:val="1"/>
-        </w:numPr>
-      </w:pPr>
-      <w:r>
-        <w:t>hl7_dictionary_service.js</w:t>
-      </w:r>
-    </w:p>
-    <w:p>
-      <w:pPr>
-        <w:pStyle w:val="ListParagraph"/>
-        <w:numPr>
-          <w:ilvl w:val="1"/>
-          <w:numId w:val="1"/>
-        </w:numPr>
-      </w:pPr>
-      <w:r>
-        <w:t>hl7ParserService.js</w:t>
-      </w:r>
-    </w:p>
-    <w:p>
-      <w:pPr>
-        <w:pStyle w:val="ListParagraph"/>
-        <w:numPr>
-          <w:ilvl w:val="1"/>
-          <w:numId w:val="1"/>
-        </w:numPr>
-      </w:pPr>
-      <w:r>
-        <w:t>hl7SchemaService.js</w:t>
-      </w:r>
-    </w:p>
-    <w:p>
-      <w:pPr>
-        <w:pStyle w:val="ListParagraph"/>
-        <w:numPr>
-          <w:ilvl w:val="1"/>
-          <w:numId w:val="1"/>
-        </w:numPr>
-      </w:pPr>
-      <w:r>
-        <w:t>userService.js</w:t>
+        <w:t>server.js</w:t>
       </w:r>
     </w:p>
     <w:p>
@@ -905,7 +1293,7 @@
         </w:numPr>
       </w:pPr>
       <w:r>
-        <w:t>.env</w:t>
+        <w:t>start.sh</w:t>
       </w:r>
     </w:p>
     <w:p>
@@ -917,7 +1305,7 @@
         </w:numPr>
       </w:pPr>
       <w:r>
-        <w:t>app.js</w:t>
+        <w:t>build-docker.sh</w:t>
       </w:r>
     </w:p>
     <w:p>
@@ -929,8 +1317,13 @@
         </w:numPr>
       </w:pPr>
       <w:r>
-        <w:t>go.mod</w:t>
-      </w:r>
+        <w:t>docker-</w:t>
+      </w:r>
+      <w:proofErr w:type="spellStart"/>
+      <w:r>
+        <w:t>compose.yml</w:t>
+      </w:r>
+      <w:proofErr w:type="spellEnd"/>
     </w:p>
     <w:p>
       <w:pPr>
@@ -940,57 +1333,11 @@
           <w:numId w:val="1"/>
         </w:numPr>
       </w:pPr>
-      <w:r>
-        <w:t>go.sum</w:t>
-      </w:r>
-    </w:p>
-    <w:p>
-      <w:pPr>
-        <w:pStyle w:val="ListParagraph"/>
-        <w:numPr>
-          <w:ilvl w:val="0"/>
-          <w:numId w:val="1"/>
-        </w:numPr>
-      </w:pPr>
-      <w:r>
-        <w:t>main.go</w:t>
-      </w:r>
-    </w:p>
-    <w:p>
-      <w:pPr>
-        <w:pStyle w:val="ListParagraph"/>
-        <w:numPr>
-          <w:ilvl w:val="0"/>
-          <w:numId w:val="1"/>
-        </w:numPr>
-      </w:pPr>
-      <w:r>
-        <w:t>package.json</w:t>
-      </w:r>
-    </w:p>
-    <w:p>
-      <w:pPr>
-        <w:pStyle w:val="ListParagraph"/>
-        <w:numPr>
-          <w:ilvl w:val="0"/>
-          <w:numId w:val="1"/>
-        </w:numPr>
-      </w:pPr>
-      <w:r>
-        <w:t>server.js</w:t>
-      </w:r>
-    </w:p>
-    <w:p>
-      <w:pPr>
-        <w:pStyle w:val="ListParagraph"/>
-        <w:numPr>
-          <w:ilvl w:val="0"/>
-          <w:numId w:val="1"/>
-        </w:numPr>
-      </w:pPr>
-      <w:r>
-        <w:t>start.sh</w:t>
-      </w:r>
+      <w:proofErr w:type="spellStart"/>
+      <w:r>
+        <w:t>Dockerfile</w:t>
+      </w:r>
+      <w:proofErr w:type="spellEnd"/>
     </w:p>
     <w:sectPr>
       <w:pgSz w:w="11906" w:h="16838"/>
@@ -1007,7 +1354,7 @@
   <w:abstractNum w:abstractNumId="0" w15:restartNumberingAfterBreak="0">
     <w:nsid w:val="01C62971"/>
     <w:multiLevelType w:val="hybridMultilevel"/>
-    <w:tmpl w:val="70668F3E"/>
+    <w:tmpl w:val="6EAC2726"/>
     <w:lvl w:ilvl="0" w:tplc="40090001">
       <w:start w:val="1"/>
       <w:numFmt w:val="bullet"/>
@@ -1056,7 +1403,7 @@
         <w:rFonts w:ascii="Symbol" w:hAnsi="Symbol" w:hint="default"/>
       </w:rPr>
     </w:lvl>
-    <w:lvl w:ilvl="4" w:tplc="40090003" w:tentative="1">
+    <w:lvl w:ilvl="4" w:tplc="40090003">
       <w:start w:val="1"/>
       <w:numFmt w:val="bullet"/>
       <w:lvlText w:val="o"/>
@@ -1068,7 +1415,7 @@
         <w:rFonts w:ascii="Courier New" w:hAnsi="Courier New" w:cs="Courier New" w:hint="default"/>
       </w:rPr>
     </w:lvl>
-    <w:lvl w:ilvl="5" w:tplc="40090005" w:tentative="1">
+    <w:lvl w:ilvl="5" w:tplc="40090005">
       <w:start w:val="1"/>
       <w:numFmt w:val="bullet"/>
       <w:lvlText w:val=""/>

</xml_diff>